<commit_message>
ISR files: state model sizes precisely, remove placeholders from cover letter
Co-Authored-By: Claude Sonnet 5.5 <noreply@anthropic.com>
Claude-Session: https://claude.ai/code/session_013HycsBHnRQDCEHKmLM3Rd4
</commit_message>
<xml_diff>
--- a/loss_chasing/isr/ISR_cover_letter.docx
+++ b/loss_chasing/isr/ISR_cover_letter.docx
@@ -12,7 +12,7 @@
           <w:sz w:val="24"/>
           <w:szCs w:val="24"/>
         </w:rPr>
-        <w:t xml:space="preserve">[Date]</w:t>
+        <w:t xml:space="preserve">Dear Editor,</w:t>
       </w:r>
     </w:p>
     <w:p>
@@ -25,7 +25,7 @@
           <w:sz w:val="24"/>
           <w:szCs w:val="24"/>
         </w:rPr>
-        <w:t xml:space="preserve">Editor-in-Chief — </w:t>
+        <w:t xml:space="preserve">We submit the enclosed manuscript, "Loss Chasing in Large Language Model Maintenance Decisions: A Human-Subject-Free Behavioral Evaluation," for consideration in </w:t>
       </w:r>
       <w:r>
         <w:rPr>
@@ -37,44 +37,13 @@
         </w:rPr>
         <w:t xml:space="preserve">Information Systems Research</w:t>
       </w:r>
-    </w:p>
-    <w:p>
-      <w:pPr>
-        <w:spacing w:after="160" w:before="0" w:line="276"/>
-      </w:pPr>
-      <w:r>
-        <w:rPr>
-          <w:rFonts w:ascii="Times New Roman" w:cs="Times New Roman" w:eastAsia="Times New Roman" w:hAnsi="Times New Roman"/>
-          <w:sz w:val="24"/>
-          <w:szCs w:val="24"/>
-        </w:rPr>
-        <w:t xml:space="preserve">Re: Submission, "Loss Chasing in Large Language Model Maintenance Decisions: A Human-Subject-Free Behavioral Evaluation"</w:t>
-      </w:r>
-    </w:p>
-    <w:p>
-      <w:pPr>
-        <w:spacing w:after="160" w:before="0" w:line="276"/>
-      </w:pPr>
-      <w:r>
-        <w:rPr>
-          <w:rFonts w:ascii="Times New Roman" w:cs="Times New Roman" w:eastAsia="Times New Roman" w:hAnsi="Times New Roman"/>
-          <w:sz w:val="24"/>
-          <w:szCs w:val="24"/>
-        </w:rPr>
-        <w:t xml:space="preserve">Dear Editor,</w:t>
-      </w:r>
-    </w:p>
-    <w:p>
-      <w:pPr>
-        <w:spacing w:after="160" w:before="0" w:line="276"/>
-      </w:pPr>
-      <w:r>
-        <w:rPr>
-          <w:rFonts w:ascii="Times New Roman" w:cs="Times New Roman" w:eastAsia="Times New Roman" w:hAnsi="Times New Roman"/>
-          <w:sz w:val="24"/>
-          <w:szCs w:val="24"/>
-        </w:rPr>
-        <w:t xml:space="preserve">We submit the enclosed manuscript for consideration. The manuscript file is prepared for double-anonymous review (no author information, and the code repository link is withheld). This cover letter contains the contribution statement and the prior-publication statement required by the journal; it should be kept separate from the anonymized manuscript.</w:t>
+      <w:r>
+        <w:rPr>
+          <w:rFonts w:ascii="Times New Roman" w:cs="Times New Roman" w:eastAsia="Times New Roman" w:hAnsi="Times New Roman"/>
+          <w:sz w:val="24"/>
+          <w:szCs w:val="24"/>
+        </w:rPr>
+        <w:t xml:space="preserve">. The manuscript file is prepared for double-anonymous review: it contains no author information, and the link to the code repository is withheld. This letter contains the contribution statement required by the journal and is kept separate from the anonymized manuscript.</w:t>
       </w:r>
     </w:p>
     <w:p>
@@ -158,7 +127,7 @@
           <w:sz w:val="24"/>
           <w:szCs w:val="24"/>
         </w:rPr>
-        <w:t xml:space="preserve">Prior publication and related work</w:t>
+        <w:t xml:space="preserve">Relation to prior work</w:t>
       </w:r>
     </w:p>
     <w:p>
@@ -171,23 +140,7 @@
           <w:sz w:val="24"/>
           <w:szCs w:val="24"/>
         </w:rPr>
-        <w:t xml:space="preserve">The manuscript has not been published and is not under review elsewhere. [AUTHORS TO CONFIRM: whether the registered protocol that this study implements has been posted publicly or submitted anywhere, and, if so, how this manuscript differs: it adds the executed runs, the excess-risk measurement argument, and the discussion.]</w:t>
-      </w:r>
-    </w:p>
-    <w:p>
-      <w:pPr>
-        <w:keepNext/>
-        <w:spacing w:after="120" w:before="120"/>
-      </w:pPr>
-      <w:r>
-        <w:rPr>
-          <w:rFonts w:ascii="Times New Roman" w:cs="Times New Roman" w:eastAsia="Times New Roman" w:hAnsi="Times New Roman"/>
-          <w:b/>
-          <w:bCs/>
-          <w:sz w:val="24"/>
-          <w:szCs w:val="24"/>
-        </w:rPr>
-        <w:t xml:space="preserve">Other disclosures</w:t>
+        <w:t xml:space="preserve">The study implements a pre-specified evaluation protocol. The manuscript adds the executed runs on three models, the measurement argument about excess risk and floor effects, and the discussion for information systems practice.</w:t>
       </w:r>
     </w:p>
     <w:p>
@@ -200,7 +153,7 @@
           <w:sz w:val="24"/>
           <w:szCs w:val="24"/>
         </w:rPr>
-        <w:t xml:space="preserve">[AUTHORS TO COMPLETE: suggested Senior/Associate Editors and reviewers, conflicts of interest, funding, and the journal's policy on disclosure of AI tools used in preparing the manuscript. Check the current policy on the journal's website before submission.]</w:t>
+        <w:t xml:space="preserve">Sincerely,</w:t>
       </w:r>
     </w:p>
     <w:p>
@@ -213,7 +166,7 @@
           <w:sz w:val="24"/>
           <w:szCs w:val="24"/>
         </w:rPr>
-        <w:t xml:space="preserve">Sincerely, [Corresponding author]</w:t>
+        <w:t xml:space="preserve">The authors</w:t>
       </w:r>
     </w:p>
     <w:sectPr>

</xml_diff>

<commit_message>
Rewrite manuscript around wording robustness; add wording data; update cover letter
Co-Authored-By: Claude Sonnet 5.5 <noreply@anthropic.com>
Claude-Session: https://claude.ai/code/session_013HycsBHnRQDCEHKmLM3Rd4
</commit_message>
<xml_diff>
--- a/loss_chasing/isr/ISR_cover_letter.docx
+++ b/loss_chasing/isr/ISR_cover_letter.docx
@@ -72,7 +72,7 @@
           <w:sz w:val="24"/>
           <w:szCs w:val="24"/>
         </w:rPr>
-        <w:t xml:space="preserve">Organizations are beginning to consider large language models (LLMs) as operators of other AI systems: deciding when to patch, redeploy, roll back, or skip regression tests. Whether such an operator is sensitive to how a failure is described is unknown, and the behavioral-economics prediction (loss chasing after a realized loss) has been tested in one-shot economic tasks and in text generation, not in a repeated operational loop.</w:t>
+        <w:t xml:space="preserve">Organizations are beginning to consider large language models (LLMs) as operators of other AI systems: deciding when to patch, redeploy, roll back, or skip regression tests. Whether such an operator is sensitive to how a failure is described is unknown. The behavioral-economics prediction, loss chasing after a realized loss, has been tested in one-shot economic tasks and in text generation, not in a repeated operational loop.</w:t>
       </w:r>
     </w:p>
     <w:p>
@@ -85,7 +85,7 @@
           <w:sz w:val="24"/>
           <w:szCs w:val="24"/>
         </w:rPr>
-        <w:t xml:space="preserve">This paper contributes in three ways. First, it formalizes LLM maintenance as a repeated prospect-theoretic choice and defines loss chasing through three jointly necessary conditions, one of which requires that the chosen action be inferior in expected value. We construct a six-action environment in which skipping tests is dominated by its verified counterpart, so a rise in skipping cannot be explained as a rational response to a time budget. Second, it identifies a measurement problem that affects any such evaluation: when a rollback option recovers a realized loss at positive expected value, a rational operator lowers its risk after failures, so the natural "risk rises after failures" test mislabels rational retreat and non-retreat. We propose excess risk over an expected-value-maximizing benchmark, combined with test-skipping, and we show that a model that never skips makes a framing test uninformative. Third, it provides an open, human-subject-free audit that an organization can run on a candidate model before delegating maintenance decisions to it.</w:t>
+        <w:t xml:space="preserve">The paper contributes in four ways. First, it formalizes LLM maintenance as a repeated prospect-theoretic choice and defines loss chasing through three jointly necessary conditions, one of which requires the chosen action to be inferior in expected value; we build a six-action environment in which skipping tests is dominated by its verified counterpart. Second, it identifies a measurement problem in any such evaluation: when a rollback option recovers a realized loss at positive expected value, a rational operator lowers its risk after failures, so the natural "risk rises after failures" test is invalid; we propose excess risk over an expected-value benchmark combined with test-skipping. Third, it shows that one wording per frame cannot support a framing claim: in a commercial model, equivalent sentences for the same frame produced anywhere from 0% to 97% test-skipping, and we provide a paraphrase design for estimating frame effects. Fourth, it provides an open, human-subject-free audit that an organization can run before delegating maintenance decisions to a model.</w:t>
       </w:r>
     </w:p>
     <w:p>
@@ -98,7 +98,7 @@
           <w:sz w:val="24"/>
           <w:szCs w:val="24"/>
         </w:rPr>
-        <w:t xml:space="preserve">Empirically, the paper reports a preliminary, partial execution of a registered protocol on three models. We find no support for the framing hypothesis in any of them. The loss frame raised test-skipping by 7.7 percentage points in one open model (below the registered 10-point threshold), lowered it by 5.0 points in another, and a commercial model never skipped tests. The response to failure history differed in sign across models. The contribution is therefore not a claim that LLM operators chase losses; it is evidence that framing sensitivity is model-specific, together with a design and a measurement argument for how it should be tested.</w:t>
+        <w:t xml:space="preserve">Empirically, a preliminary, partial execution of a registered protocol on three models does not support the registered framing hypothesis. Exploratory follow-ups show that sensitivity to the sentence can exceed sensitivity to loss-versus-gain accounting in the commercial model, that one open model showed loss above gain under all four wordings, and that another did not respond. The contribution is therefore not a claim that LLM operators chase losses; it is evidence that framing sensitivity is model- and wording-specific, together with a design and a measurement argument for how it should be tested.</w:t>
       </w:r>
     </w:p>
     <w:p>
@@ -111,7 +111,7 @@
           <w:sz w:val="24"/>
           <w:szCs w:val="24"/>
         </w:rPr>
-        <w:t xml:space="preserve">For practice and policy, the results support auditing a specific model on the organization's own payoff structure before delegation, rather than adopting a general rule about dashboard wording. We are explicit about limits: three models of different families, a subset of the registered grid, and exploratory analysis choices that are labeled as such.</w:t>
+        <w:t xml:space="preserve">For practice and policy, the results support auditing a specific model on the organization's own payoff structure, with several paraphrases of each message, and treating dashboard text and prompt templates as controlled configuration, rather than adopting a general rule about wording. We state the limits plainly: three small models of different families, a subset of the registered grid, and exploratory analyses labeled as such.</w:t>
       </w:r>
     </w:p>
     <w:p>

</xml_diff>